<commit_message>
Remove duplicate Discussion conclusions, regenerate CCT deliverables
Co-Authored-By: Tatsuki Onishi <bougtoir@gmail.com>
</commit_message>
<xml_diff>
--- a/rct-decomposition/KOTHA_Framework_CCT.docx
+++ b/rct-decomposition/KOTHA_Framework_CCT.docx
@@ -52,7 +52,7 @@
           <w:i w:val="0"/>
           <w:sz w:val="24"/>
         </w:rPr>
-        <w:t>Word count: 2157</w:t>
+        <w:t>Word count: 2107</w:t>
       </w:r>
     </w:p>
     <w:p>
@@ -6692,28 +6692,6 @@
           <w:sz w:val="24"/>
         </w:rPr>
         <w:t>Limitations should be acknowledged. The cases are retrospective applications; prospective validation against trials whose results are not yet known would be stronger. Module T results are sensitive to the discounting parameter α and to assumptions about residual confounding; we present sensitivity analyses but do not claim a single preferred α. The magnesium case involves genuine treatment-effect heterogeneity across thrombolysis eras, which Module K identifies but cannot fully explain. Finally, adoption by guideline groups will require institutional change beyond the method itself.</w:t>
-      </w:r>
-    </w:p>
-    <w:p>
-      <w:pPr>
-        <w:pStyle w:val="Heading3"/>
-      </w:pPr>
-      <w:r>
-        <w:rPr>
-          <w:color w:val="000000"/>
-        </w:rPr>
-        <w:t>Conclusions</w:t>
-      </w:r>
-    </w:p>
-    <w:p>
-      <w:r>
-        <w:rPr>
-          <w:rFonts w:ascii="Times New Roman" w:hAnsi="Times New Roman"/>
-          <w:b w:val="0"/>
-          <w:i w:val="0"/>
-          <w:sz w:val="24"/>
-        </w:rPr>
-        <w:t>The KOTHA Framework offers a reproducible, quantitative approach to distinguishing "evidence of no effect" from "no evidence of effect." By reframing the central question as whether the evidence base has sufficient information to answer the clinical question, it can guide more nuanced trial design, evidence synthesis, and guideline recommendations.</w:t>
       </w:r>
     </w:p>
     <w:p>

</xml_diff>

<commit_message>
fix: spell out KOTHA acronym on first use in abstract and introduction (full spelling before acronym)
Co-Authored-By: Tatsuki Onishi <bougtoir@gmail.com>
</commit_message>
<xml_diff>
--- a/rct-decomposition/KOTHA_Framework_CCT.docx
+++ b/rct-decomposition/KOTHA_Framework_CCT.docx
@@ -110,7 +110,7 @@
           <w:i w:val="0"/>
           <w:sz w:val="24"/>
         </w:rPr>
-        <w:t>: Evidence-based medicine places randomized controlled trials (RCTs) and their meta-analyses at the top of the evidence hierarchy [1]. Discordance between observational and RCT evidence is often attributed to confounding, but an underexplored structural explanation is that trial enrollment progressively excludes higher-risk patients, diluting event rates and reducing statistical information. We developed the KOTHA (Knowledge-driven Observational-Trial Harmonization Approach) Framework to diagnose and address this structural information loss.</w:t>
+        <w:t>: Evidence-based medicine places randomized controlled trials (RCTs) and their meta-analyses at the top of the evidence hierarchy [1]. Discordance between observational and RCT evidence is often attributed to confounding, but an underexplored structural explanation is that trial enrollment progressively excludes higher-risk patients, diluting event rates and reducing statistical information. We developed the Knowledge-driven Observational-Trial Harmonization Approach (KOTHA) Framework to diagnose and address this structural information loss.</w:t>
       </w:r>
     </w:p>
     <w:p>
@@ -779,7 +779,7 @@
           <w:i w:val="0"/>
           <w:sz w:val="24"/>
         </w:rPr>
-        <w:t>We therefore developed the KOTHA (Knowledge-driven Observational-Trial Harmonization Approach) Framework. It is a three-module system that (1) diagnoses structural information loss through counterfactual power simulation (Module K), (2) integrates discordant evidence through hierarchical Bayesian meta-analysis (Module T), and (3) translates quantitative findings into GRADE-compatible evidence assessment (Module H). This paper describes the framework and illustrates its application to two canonical cases of observational-RCT divergence, with an emphasis on implications for clinical trial design.</w:t>
+        <w:t>We therefore developed the Knowledge-driven Observational-Trial Harmonization Approach (KOTHA) Framework. It is a three-module system that (1) diagnoses structural information loss through counterfactual power simulation (Module K), (2) integrates discordant evidence through hierarchical Bayesian meta-analysis (Module T), and (3) translates quantitative findings into GRADE-compatible evidence assessment (Module H). This paper describes the framework and illustrates its application to two canonical cases of observational-RCT divergence, with an emphasis on implications for clinical trial design.</w:t>
       </w:r>
     </w:p>
     <w:p>

</xml_diff>

<commit_message>
Clean math in figure captions for CCT docx
- generate_cct_docx.py converts inline math in figure captions to Unicode text so raw $...$ no longer appears in the docx.

- Regenerate CCT docx, figures.pptx, tables.docx, and zips.

Co-Authored-By: Tatsuki Onishi <bougtoir@gmail.com>
</commit_message>
<xml_diff>
--- a/rct-decomposition/KOTHA_Framework_CCT.docx
+++ b/rct-decomposition/KOTHA_Framework_CCT.docx
@@ -6425,7 +6425,7 @@
           <w:rFonts w:ascii="Times New Roman" w:hAnsi="Times New Roman"/>
           <w:sz w:val="20"/>
         </w:rPr>
-        <w:t>Forest plot for magnesium in AMI. Individual study odds ratios are shown with 95% confidence intervals, color-coded by era. Pooled estimates include frequentist random-effects (pre-ISIS-4 and all trials) and Bayesian integrated estimates at selected discounting levels ($\alpha$ = 0.3, 0.5, 1.0).</w:t>
+        <w:t>Forest plot for magnesium in AMI. Individual study odds ratios are shown with 95% confidence intervals, color-coded by era. Pooled estimates include frequentist random-effects (pre-ISIS-4 and all trials) and Bayesian integrated estimates at selected discounting levels (α = 0.3, 0.5, 1.0).</w:t>
       </w:r>
     </w:p>
     <w:p>
@@ -6633,7 +6633,7 @@
           <w:rFonts w:ascii="Times New Roman" w:hAnsi="Times New Roman"/>
           <w:sz w:val="20"/>
         </w:rPr>
-        <w:t>Forest plot for statins in heart failure. Individual study hazard ratios are shown with 95% confidence intervals, grouped by design. Pooled estimates include design-specific frequentist pooling and KOTHA-integrated estimates at selected discounting levels ($\alpha$ = 0.1, 0.3, 0.5).</w:t>
+        <w:t>Forest plot for statins in heart failure. Individual study hazard ratios are shown with 95% confidence intervals, grouped by design. Pooled estimates include design-specific frequentist pooling and KOTHA-integrated estimates at selected discounting levels (α = 0.1, 0.3, 0.5).</w:t>
       </w:r>
     </w:p>
     <w:p>
@@ -8306,7 +8306,7 @@
           <w:rFonts w:ascii="Times New Roman" w:hAnsi="Times New Roman"/>
           <w:sz w:val="20"/>
         </w:rPr>
-        <w:t>Sensitivity analysis of Bayesian integration to the discounting parameter $\alpha$. (A) Magnesium in AMI. (B) Statins in HF. Three posterior probability thresholds are shown: P(effect &lt; 1.0), P(effect &lt; 0.90), and P(effect &lt; 0.80). Horizontal dashed line indicates 95% probability.</w:t>
+        <w:t>Sensitivity analysis of Bayesian integration to the discounting parameter α. (A) Magnesium in AMI. (B) Statins in HF. Three posterior probability thresholds are shown: P(effect &lt; 1.0), P(effect &lt; 0.90), and P(effect &lt; 0.80). Horizontal dashed line indicates 95% probability.</w:t>
       </w:r>
     </w:p>
     <w:p>

</xml_diff>